<commit_message>
feat: add LinkedIn post generation endpoint and AI service integration - implement prompt, tone, and goal-based AI post generation flow - connect Chrome extension popup to backend generate endpoint - display generated post, hashtags, and CTA in popup UI with loading state - enhance popup UX with copy functionality and auth-first navigation flow
</commit_message>
<xml_diff>
--- a/Task-breakdown.docx
+++ b/Task-breakdown.docx
@@ -1430,8 +1430,6 @@
       </w:r>
     </w:p>
     <w:p/>
-    <w:p/>
-    <w:p/>
     <w:p>
       <w:pPr>
         <w:numPr>
@@ -1575,7 +1573,6 @@
         </w:numPr>
       </w:pPr>
       <w:r>
-        <w:lastRenderedPageBreak/>
         <w:t xml:space="preserve">log event in </w:t>
       </w:r>
       <w:proofErr w:type="spellStart"/>
@@ -1819,6 +1816,7 @@
     </w:p>
     <w:p>
       <w:r>
+        <w:lastRenderedPageBreak/>
         <w:t>• working Node.js backend</w:t>
       </w:r>
       <w:r>
@@ -2049,9 +2047,6 @@
       </w:r>
       <w:r>
         <w:br/>
-      </w:r>
-      <w:r>
-        <w:lastRenderedPageBreak/>
         <w:t>• caching tone and goal</w:t>
       </w:r>
       <w:r>
@@ -2326,15 +2321,15 @@
           <w:b/>
           <w:bCs/>
         </w:rPr>
+        <w:t>Deliverables</w:t>
+      </w:r>
+    </w:p>
+    <w:p>
+      <w:pPr>
+        <w:ind w:left="720"/>
+      </w:pPr>
+      <w:r>
         <w:lastRenderedPageBreak/>
-        <w:t>Deliverables</w:t>
-      </w:r>
-    </w:p>
-    <w:p>
-      <w:pPr>
-        <w:ind w:left="720"/>
-      </w:pPr>
-      <w:r>
         <w:t>• users can sign up</w:t>
       </w:r>
       <w:r>
@@ -2578,6 +2573,7 @@
           <w:b/>
           <w:bCs/>
         </w:rPr>
+        <w:lastRenderedPageBreak/>
         <w:t>Phase 6 - Popup editing tools</w:t>
       </w:r>
     </w:p>
@@ -2846,18 +2842,18 @@
         </w:numPr>
       </w:pPr>
       <w:r>
+        <w:t>handle edge cases</w:t>
+      </w:r>
+    </w:p>
+    <w:p>
+      <w:pPr>
+        <w:numPr>
+          <w:ilvl w:val="0"/>
+          <w:numId w:val="55"/>
+        </w:numPr>
+      </w:pPr>
+      <w:r>
         <w:lastRenderedPageBreak/>
-        <w:t>handle edge cases</w:t>
-      </w:r>
-    </w:p>
-    <w:p>
-      <w:pPr>
-        <w:numPr>
-          <w:ilvl w:val="0"/>
-          <w:numId w:val="55"/>
-        </w:numPr>
-      </w:pPr>
-      <w:r>
         <w:t>improve error messaging</w:t>
       </w:r>
     </w:p>
@@ -3106,18 +3102,18 @@
           <w:b/>
           <w:bCs/>
         </w:rPr>
+        <w:t>Demo storyline</w:t>
+      </w:r>
+    </w:p>
+    <w:p>
+      <w:pPr>
+        <w:numPr>
+          <w:ilvl w:val="0"/>
+          <w:numId w:val="57"/>
+        </w:numPr>
+      </w:pPr>
+      <w:r>
         <w:lastRenderedPageBreak/>
-        <w:t>Demo storyline</w:t>
-      </w:r>
-    </w:p>
-    <w:p>
-      <w:pPr>
-        <w:numPr>
-          <w:ilvl w:val="0"/>
-          <w:numId w:val="57"/>
-        </w:numPr>
-      </w:pPr>
-      <w:r>
         <w:t>Open LinkedIn</w:t>
       </w:r>
     </w:p>
@@ -3402,21 +3398,21 @@
       </w:pPr>
       <w:proofErr w:type="spellStart"/>
       <w:r>
+        <w:t>generated_posts</w:t>
+      </w:r>
+      <w:proofErr w:type="spellEnd"/>
+    </w:p>
+    <w:p>
+      <w:pPr>
+        <w:pStyle w:val="ListParagraph"/>
+        <w:numPr>
+          <w:ilvl w:val="0"/>
+          <w:numId w:val="59"/>
+        </w:numPr>
+      </w:pPr>
+      <w:proofErr w:type="spellStart"/>
+      <w:r>
         <w:lastRenderedPageBreak/>
-        <w:t>generated_posts</w:t>
-      </w:r>
-      <w:proofErr w:type="spellEnd"/>
-    </w:p>
-    <w:p>
-      <w:pPr>
-        <w:pStyle w:val="ListParagraph"/>
-        <w:numPr>
-          <w:ilvl w:val="0"/>
-          <w:numId w:val="59"/>
-        </w:numPr>
-      </w:pPr>
-      <w:proofErr w:type="spellStart"/>
-      <w:r>
         <w:t>usage_events</w:t>
       </w:r>
       <w:proofErr w:type="spellEnd"/>

</xml_diff>